<commit_message>
Update poster sections to match final poster
</commit_message>
<xml_diff>
--- a/04-Development-and-Quality-Assurance/Poster/Sections/01 Background.docx
+++ b/04-Development-and-Quality-Assurance/Poster/Sections/01 Background.docx
@@ -3,228 +3,184 @@
 <w:document xmlns:wpc="http://schemas.microsoft.com/office/word/2010/wordprocessingCanvas" xmlns:cx="http://schemas.microsoft.com/office/drawing/2014/chartex" xmlns:cx1="http://schemas.microsoft.com/office/drawing/2015/9/8/chartex" xmlns:cx2="http://schemas.microsoft.com/office/drawing/2015/10/21/chartex" xmlns:cx3="http://schemas.microsoft.com/office/drawing/2016/5/9/chartex" xmlns:cx4="http://schemas.microsoft.com/office/drawing/2016/5/10/chartex" xmlns:cx5="http://schemas.microsoft.com/office/drawing/2016/5/11/chartex" xmlns:cx6="http://schemas.microsoft.com/office/drawing/2016/5/12/chartex" xmlns:cx7="http://schemas.microsoft.com/office/drawing/2016/5/13/chartex" xmlns:cx8="http://schemas.microsoft.com/office/drawing/2016/5/14/chartex" xmlns:mc="http://schemas.openxmlformats.org/markup-compatibility/2006" xmlns:aink="http://schemas.microsoft.com/office/drawing/2016/ink" xmlns:am3d="http://schemas.microsoft.com/office/drawing/2017/model3d" xmlns:o="urn:schemas-microsoft-com:office:office" xmlns:oel="http://schemas.microsoft.com/office/2019/extlst" xmlns:r="http://schemas.openxmlformats.org/officeDocument/2006/relationships" xmlns:m="http://schemas.openxmlformats.org/officeDocument/2006/math" xmlns:v="urn:schemas-microsoft-com:vml" xmlns:wp14="http://schemas.microsoft.com/office/word/2010/wordprocessingDrawing" xmlns:wp="http://schemas.openxmlformats.org/drawingml/2006/wordprocessingDrawing" xmlns:w10="urn:schemas-microsoft-com:office:word" xmlns:w="http://schemas.openxmlformats.org/wordprocessingml/2006/main" xmlns:w14="http://schemas.microsoft.com/office/word/2010/wordml" xmlns:w15="http://schemas.microsoft.com/office/word/2012/wordml" xmlns:w16cex="http://schemas.microsoft.com/office/word/2018/wordml/cex" xmlns:w16cid="http://schemas.microsoft.com/office/word/2016/wordml/cid" xmlns:w16="http://schemas.microsoft.com/office/word/2018/wordml" xmlns:w16du="http://schemas.microsoft.com/office/word/2023/wordml/word16du" xmlns:w16sdtdh="http://schemas.microsoft.com/office/word/2020/wordml/sdtdatahash" xmlns:w16sdtfl="http://schemas.microsoft.com/office/word/2024/wordml/sdtformatlock" xmlns:w16se="http://schemas.microsoft.com/office/word/2015/wordml/symex" xmlns:wpg="http://schemas.microsoft.com/office/word/2010/wordprocessingGroup" xmlns:wpi="http://schemas.microsoft.com/office/word/2010/wordprocessingInk" xmlns:wne="http://schemas.microsoft.com/office/word/2006/wordml" xmlns:wps="http://schemas.microsoft.com/office/word/2010/wordprocessingShape" mc:Ignorable="w14 w15 w16se w16cid w16 w16cex w16sdtdh w16sdtfl w16du wp14">
   <w:body>
     <w:p>
-      <w:r>
-        <w:t xml:space="preserve">The Internet Protocol </w:t>
-      </w:r>
-      <w:r>
-        <w:t>is constantly evolving</w:t>
-      </w:r>
-      <w:r>
-        <w:t xml:space="preserve"> </w:t>
-      </w:r>
-      <w:r>
-        <w:t xml:space="preserve">due to the </w:t>
-      </w:r>
-      <w:r>
-        <w:t xml:space="preserve">ever-increasing demand for </w:t>
-      </w:r>
-      <w:r>
-        <w:t xml:space="preserve">global connectivity, but </w:t>
-      </w:r>
-      <w:r>
-        <w:t xml:space="preserve">limitations in the </w:t>
-      </w:r>
-      <w:r>
-        <w:t>commonly used</w:t>
-      </w:r>
-      <w:r>
-        <w:t xml:space="preserve"> IPv4 </w:t>
-      </w:r>
-      <w:r>
-        <w:t xml:space="preserve">protocol </w:t>
-      </w:r>
-      <w:r>
-        <w:t xml:space="preserve">are rapidly </w:t>
-      </w:r>
-      <w:r>
-        <w:t>making it</w:t>
-      </w:r>
-      <w:r>
-        <w:t xml:space="preserve"> a</w:t>
-      </w:r>
-      <w:r>
-        <w:t>n</w:t>
-      </w:r>
-      <w:r>
-        <w:t xml:space="preserve"> </w:t>
-      </w:r>
-      <w:r>
-        <w:t>hindrance</w:t>
-      </w:r>
-      <w:r>
-        <w:t xml:space="preserve"> </w:t>
-      </w:r>
-      <w:r>
-        <w:t>(Ugwumba &amp; Jaja, 2025)</w:t>
-      </w:r>
-      <w:r>
-        <w:t>.</w:t>
+      <w:pPr>
+        <w:rPr>
+          <w:b/>
+          <w:bCs/>
+          <w:u w:val="single"/>
+        </w:rPr>
+      </w:pPr>
+      <w:r>
+        <w:rPr>
+          <w:b/>
+          <w:bCs/>
+          <w:u w:val="single"/>
+        </w:rPr>
+        <w:t>Original:</w:t>
       </w:r>
     </w:p>
     <w:p>
       <w:r>
-        <w:t>IPv6 is intended to replace IPv4, as it has</w:t>
-      </w:r>
-      <w:r>
-        <w:t xml:space="preserve"> advantages such as</w:t>
-      </w:r>
-      <w:r>
-        <w:t xml:space="preserve"> exponentially more available addresses</w:t>
-      </w:r>
-      <w:r>
-        <w:t xml:space="preserve"> (</w:t>
-      </w:r>
-      <w:r>
-        <w:t>≈</w:t>
-      </w:r>
-      <w:r>
-        <w:t xml:space="preserve">4.3 billion vs. </w:t>
-      </w:r>
-      <w:r>
-        <w:t>≈</w:t>
-      </w:r>
-      <w:r>
-        <w:t>340 undecillion</w:t>
-      </w:r>
-      <w:r>
-        <w:t>)</w:t>
-      </w:r>
-      <w:r>
-        <w:t>,</w:t>
-      </w:r>
-      <w:r>
-        <w:t xml:space="preserve"> better security features, and </w:t>
-      </w:r>
-      <w:r>
-        <w:t>improved routing efficiency</w:t>
-      </w:r>
-      <w:r>
-        <w:t xml:space="preserve"> (Amazon, 2025).</w:t>
+        <w:t xml:space="preserve">The Internet Protocol </w:t>
+      </w:r>
+      <w:r>
+        <w:t>is constantly evolving</w:t>
+      </w:r>
+      <w:r>
+        <w:t xml:space="preserve"> </w:t>
+      </w:r>
+      <w:r>
+        <w:t xml:space="preserve">due to the </w:t>
+      </w:r>
+      <w:r>
+        <w:t xml:space="preserve">ever-increasing demand for </w:t>
+      </w:r>
+      <w:r>
+        <w:t xml:space="preserve">global connectivity, but </w:t>
+      </w:r>
+      <w:r>
+        <w:t xml:space="preserve">limitations in the </w:t>
+      </w:r>
+      <w:r>
+        <w:t>commonly used</w:t>
+      </w:r>
+      <w:r>
+        <w:t xml:space="preserve"> IPv4 </w:t>
+      </w:r>
+      <w:r>
+        <w:t xml:space="preserve">protocol </w:t>
+      </w:r>
+      <w:r>
+        <w:t xml:space="preserve">are rapidly </w:t>
+      </w:r>
+      <w:r>
+        <w:t>making it</w:t>
+      </w:r>
+      <w:r>
+        <w:t xml:space="preserve"> </w:t>
+      </w:r>
+      <w:proofErr w:type="gramStart"/>
+      <w:r>
+        <w:t>a</w:t>
+      </w:r>
+      <w:r>
+        <w:t>n</w:t>
+      </w:r>
+      <w:proofErr w:type="gramEnd"/>
+      <w:r>
+        <w:t xml:space="preserve"> </w:t>
+      </w:r>
+      <w:r>
+        <w:t>hindrance</w:t>
+      </w:r>
+      <w:r>
+        <w:t xml:space="preserve"> </w:t>
+      </w:r>
+      <w:r>
+        <w:t>(</w:t>
+      </w:r>
+      <w:proofErr w:type="spellStart"/>
+      <w:r>
+        <w:t>Ugwumba</w:t>
+      </w:r>
+      <w:proofErr w:type="spellEnd"/>
+      <w:r>
+        <w:t xml:space="preserve"> &amp; Jaja, 2025)</w:t>
+      </w:r>
+      <w:r>
+        <w:t>.</w:t>
       </w:r>
     </w:p>
     <w:p>
       <w:r>
-        <w:t xml:space="preserve">Dr. Raymond Lutui has requested an evaluation of the network performance of three Linux-based operating systems configured as software routers to determine which has the best performance across both IPv4 and IPv6, and to compare the data with his previous evaluations. </w:t>
-      </w:r>
-    </w:p>
-    <w:p/>
-    <w:p>
-      <w:r>
-        <w:t>Summarised version:</w:t>
+        <w:t>IPv6 is intended to replace IPv4, as it has</w:t>
+      </w:r>
+      <w:r>
+        <w:t xml:space="preserve"> advantages such as</w:t>
+      </w:r>
+      <w:r>
+        <w:t xml:space="preserve"> exponentially more available addresses</w:t>
+      </w:r>
+      <w:r>
+        <w:t xml:space="preserve"> (</w:t>
+      </w:r>
+      <w:r>
+        <w:t>≈</w:t>
+      </w:r>
+      <w:r>
+        <w:t xml:space="preserve">4.3 billion vs. </w:t>
+      </w:r>
+      <w:r>
+        <w:t>≈</w:t>
+      </w:r>
+      <w:r>
+        <w:t>340 undecillion</w:t>
+      </w:r>
+      <w:r>
+        <w:t>)</w:t>
+      </w:r>
+      <w:r>
+        <w:t>,</w:t>
+      </w:r>
+      <w:r>
+        <w:t xml:space="preserve"> better security features, and </w:t>
+      </w:r>
+      <w:r>
+        <w:t>improved routing efficiency</w:t>
+      </w:r>
+      <w:r>
+        <w:t xml:space="preserve"> (Amazon, 2025).</w:t>
       </w:r>
     </w:p>
     <w:p>
       <w:r>
-        <w:t xml:space="preserve">The Internet Protocol continues to evolve to meet growing global connectivity demands, but IPv4’s limits are making it an hindrance (Ugwumba &amp; Jaja, 2025). </w:t>
-      </w:r>
-    </w:p>
-    <w:p>
-      <w:r>
-        <w:t xml:space="preserve">IPv6, its intended replacement, offers more addresses (≈4.3 billion vs. ≈340 undecillion), stronger security features, and improved routing efficiency (Amazon, 2025). </w:t>
-      </w:r>
-    </w:p>
-    <w:p>
-      <w:r>
-        <w:rPr/>
-        <w:t>Our client requested an evaluation of the network performance of three Linux-based operating systems configured as routers, to determine which performs best under both IPv4 and IPv6, and to compare the results with his previous evaluations.</w:t>
-      </w:r>
-    </w:p>
-    <w:p/>
-    <w:p>
-      <w:r>
-        <w:rPr/>
-        <w:t>Finalised edit for poster:</w:t>
+        <w:t xml:space="preserve">Dr. Raymond Lutui has requested an evaluation of the network performance of three Linux-based operating systems configured as software routers to determine which has the best performance across both IPv4 and IPv6, and to compare the data with his previous evaluations. </w:t>
       </w:r>
     </w:p>
     <w:p>
       <w:pPr>
-        <w:spacing w:before="240" w:beforeAutospacing="off" w:after="240" w:afterAutospacing="off"/>
+        <w:spacing w:before="240" w:after="240"/>
         <w:rPr>
-          <w:rFonts w:ascii="Aptos" w:hAnsi="Aptos" w:eastAsia="Aptos" w:cs="Aptos"/>
-          <w:noProof w:val="0"/>
-          <w:sz w:val="24"/>
-          <w:szCs w:val="24"/>
-          <w:lang w:val="en-NZ"/>
+          <w:b/>
+          <w:bCs/>
+          <w:u w:val="single"/>
         </w:rPr>
       </w:pPr>
       <w:r>
         <w:rPr>
-          <w:rFonts w:ascii="Aptos" w:hAnsi="Aptos" w:eastAsia="Aptos" w:cs="Aptos"/>
-          <w:noProof w:val="0"/>
-          <w:sz w:val="24"/>
-          <w:szCs w:val="24"/>
-          <w:lang w:val="en-NZ"/>
+          <w:b/>
+          <w:bCs/>
+          <w:u w:val="single"/>
         </w:rPr>
-        <w:t>IPv4’s limits now hinder global connectivity (</w:t>
-      </w:r>
-      <w:r>
-        <w:rPr>
-          <w:rFonts w:ascii="Aptos" w:hAnsi="Aptos" w:eastAsia="Aptos" w:cs="Aptos"/>
-          <w:noProof w:val="0"/>
-          <w:sz w:val="24"/>
-          <w:szCs w:val="24"/>
-          <w:lang w:val="en-NZ"/>
-        </w:rPr>
-        <w:t>Ugwumba</w:t>
-      </w:r>
-      <w:r>
-        <w:rPr>
-          <w:rFonts w:ascii="Aptos" w:hAnsi="Aptos" w:eastAsia="Aptos" w:cs="Aptos"/>
-          <w:noProof w:val="0"/>
-          <w:sz w:val="24"/>
-          <w:szCs w:val="24"/>
-          <w:lang w:val="en-NZ"/>
-        </w:rPr>
-        <w:t xml:space="preserve"> &amp; Jaja, 2025), while IPv6 provides far more addresses (~4.3 billion vs ~340 undecillion), stronger security, and better routing (Amazon, 2025). Our client asked us to evaluate three Linux router operating systems configured as routers to </w:t>
-      </w:r>
-      <w:r>
-        <w:rPr>
-          <w:rFonts w:ascii="Aptos" w:hAnsi="Aptos" w:eastAsia="Aptos" w:cs="Aptos"/>
-          <w:noProof w:val="0"/>
-          <w:sz w:val="24"/>
-          <w:szCs w:val="24"/>
-          <w:lang w:val="en-NZ"/>
-        </w:rPr>
-        <w:t>identify</w:t>
-      </w:r>
-      <w:r>
-        <w:rPr>
-          <w:rFonts w:ascii="Aptos" w:hAnsi="Aptos" w:eastAsia="Aptos" w:cs="Aptos"/>
-          <w:noProof w:val="0"/>
-          <w:sz w:val="24"/>
-          <w:szCs w:val="24"/>
-          <w:lang w:val="en-NZ"/>
-        </w:rPr>
-        <w:t xml:space="preserve"> which performs best</w:t>
-      </w:r>
-      <w:r>
-        <w:rPr>
-          <w:rFonts w:ascii="Aptos" w:hAnsi="Aptos" w:eastAsia="Aptos" w:cs="Aptos"/>
-          <w:noProof w:val="0"/>
-          <w:sz w:val="24"/>
-          <w:szCs w:val="24"/>
-          <w:lang w:val="en-NZ"/>
-        </w:rPr>
-        <w:t xml:space="preserve"> under both IPv4 and IPv6, to compare with his prior evaluations. </w:t>
+        <w:t>Finalised:</w:t>
       </w:r>
     </w:p>
     <w:p>
       <w:pPr>
-        <w:spacing w:before="240" w:beforeAutospacing="off" w:after="240" w:afterAutospacing="off"/>
-        <w:rPr>
-          <w:rFonts w:ascii="Aptos" w:hAnsi="Aptos" w:eastAsia="Aptos" w:cs="Aptos"/>
-          <w:noProof w:val="0"/>
-          <w:sz w:val="24"/>
-          <w:szCs w:val="24"/>
-          <w:lang w:val="en-NZ"/>
-        </w:rPr>
+        <w:spacing w:before="240" w:after="240"/>
       </w:pPr>
+      <w:r>
+        <w:t>IPv4’s limits now hinder global connectivity (</w:t>
+      </w:r>
+      <w:proofErr w:type="spellStart"/>
+      <w:r>
+        <w:t>Ugwumba</w:t>
+      </w:r>
+      <w:proofErr w:type="spellEnd"/>
+      <w:r>
+        <w:t xml:space="preserve"> &amp; Jaja, 2025), while IPv6 provides exponentially more addresses, stronger security, and better routing efficiency (Amazon, 2025). </w:t>
+      </w:r>
     </w:p>
-    <w:p/>
-    <w:p/>
-    <w:p/>
+    <w:p>
+      <w:pPr>
+        <w:spacing w:before="240" w:after="240"/>
+      </w:pPr>
+      <w:r>
+        <w:t xml:space="preserve">Our client asked us to evaluate three Linux-based operating systems configured as routers to identify which performs best under both IPv4 and IPv6, to compare with his prior evaluations. </w:t>
+      </w:r>
+    </w:p>
     <w:sectPr>
-      <w:pgSz w:w="11906" w:h="16838" w:orient="portrait"/>
+      <w:pgSz w:w="11906" w:h="16838"/>
       <w:pgMar w:top="1440" w:right="1440" w:bottom="1440" w:left="1440" w:header="708" w:footer="708" w:gutter="0"/>
       <w:cols w:space="708"/>
       <w:docGrid w:linePitch="360"/>
@@ -288,7 +244,7 @@
   <w:docDefaults>
     <w:rPrDefault>
       <w:rPr>
-        <w:rFonts w:asciiTheme="minorHAnsi" w:hAnsiTheme="minorHAnsi" w:eastAsiaTheme="minorEastAsia" w:cstheme="minorBidi"/>
+        <w:rFonts w:asciiTheme="minorHAnsi" w:eastAsiaTheme="minorEastAsia" w:hAnsiTheme="minorHAnsi" w:cstheme="minorBidi"/>
         <w:kern w:val="2"/>
         <w:sz w:val="24"/>
         <w:szCs w:val="24"/>
@@ -305,14 +261,14 @@
   <w:latentStyles w:defLockedState="0" w:defUIPriority="99" w:defSemiHidden="0" w:defUnhideWhenUsed="0" w:defQFormat="0" w:count="376">
     <w:lsdException w:name="Normal" w:uiPriority="0" w:qFormat="1"/>
     <w:lsdException w:name="heading 1" w:uiPriority="9" w:qFormat="1"/>
-    <w:lsdException w:name="heading 2" w:uiPriority="9" w:semiHidden="1" w:unhideWhenUsed="1" w:qFormat="1"/>
-    <w:lsdException w:name="heading 3" w:uiPriority="9" w:semiHidden="1" w:unhideWhenUsed="1" w:qFormat="1"/>
-    <w:lsdException w:name="heading 4" w:uiPriority="9" w:semiHidden="1" w:unhideWhenUsed="1" w:qFormat="1"/>
-    <w:lsdException w:name="heading 5" w:uiPriority="9" w:semiHidden="1" w:unhideWhenUsed="1" w:qFormat="1"/>
-    <w:lsdException w:name="heading 6" w:uiPriority="9" w:semiHidden="1" w:unhideWhenUsed="1" w:qFormat="1"/>
-    <w:lsdException w:name="heading 7" w:uiPriority="9" w:semiHidden="1" w:unhideWhenUsed="1" w:qFormat="1"/>
-    <w:lsdException w:name="heading 8" w:uiPriority="9" w:semiHidden="1" w:unhideWhenUsed="1" w:qFormat="1"/>
-    <w:lsdException w:name="heading 9" w:uiPriority="9" w:semiHidden="1" w:unhideWhenUsed="1" w:qFormat="1"/>
+    <w:lsdException w:name="heading 2" w:semiHidden="1" w:uiPriority="9" w:unhideWhenUsed="1" w:qFormat="1"/>
+    <w:lsdException w:name="heading 3" w:semiHidden="1" w:uiPriority="9" w:unhideWhenUsed="1" w:qFormat="1"/>
+    <w:lsdException w:name="heading 4" w:semiHidden="1" w:uiPriority="9" w:unhideWhenUsed="1" w:qFormat="1"/>
+    <w:lsdException w:name="heading 5" w:semiHidden="1" w:uiPriority="9" w:unhideWhenUsed="1" w:qFormat="1"/>
+    <w:lsdException w:name="heading 6" w:semiHidden="1" w:uiPriority="9" w:unhideWhenUsed="1" w:qFormat="1"/>
+    <w:lsdException w:name="heading 7" w:semiHidden="1" w:uiPriority="9" w:unhideWhenUsed="1" w:qFormat="1"/>
+    <w:lsdException w:name="heading 8" w:semiHidden="1" w:uiPriority="9" w:unhideWhenUsed="1" w:qFormat="1"/>
+    <w:lsdException w:name="heading 9" w:semiHidden="1" w:uiPriority="9" w:unhideWhenUsed="1" w:qFormat="1"/>
     <w:lsdException w:name="index 1" w:semiHidden="1" w:unhideWhenUsed="1"/>
     <w:lsdException w:name="index 2" w:semiHidden="1" w:unhideWhenUsed="1"/>
     <w:lsdException w:name="index 3" w:semiHidden="1" w:unhideWhenUsed="1"/>
@@ -322,22 +278,22 @@
     <w:lsdException w:name="index 7" w:semiHidden="1" w:unhideWhenUsed="1"/>
     <w:lsdException w:name="index 8" w:semiHidden="1" w:unhideWhenUsed="1"/>
     <w:lsdException w:name="index 9" w:semiHidden="1" w:unhideWhenUsed="1"/>
-    <w:lsdException w:name="toc 1" w:uiPriority="39" w:semiHidden="1" w:unhideWhenUsed="1"/>
-    <w:lsdException w:name="toc 2" w:uiPriority="39" w:semiHidden="1" w:unhideWhenUsed="1"/>
-    <w:lsdException w:name="toc 3" w:uiPriority="39" w:semiHidden="1" w:unhideWhenUsed="1"/>
-    <w:lsdException w:name="toc 4" w:uiPriority="39" w:semiHidden="1" w:unhideWhenUsed="1"/>
-    <w:lsdException w:name="toc 5" w:uiPriority="39" w:semiHidden="1" w:unhideWhenUsed="1"/>
-    <w:lsdException w:name="toc 6" w:uiPriority="39" w:semiHidden="1" w:unhideWhenUsed="1"/>
-    <w:lsdException w:name="toc 7" w:uiPriority="39" w:semiHidden="1" w:unhideWhenUsed="1"/>
-    <w:lsdException w:name="toc 8" w:uiPriority="39" w:semiHidden="1" w:unhideWhenUsed="1"/>
-    <w:lsdException w:name="toc 9" w:uiPriority="39" w:semiHidden="1" w:unhideWhenUsed="1"/>
+    <w:lsdException w:name="toc 1" w:semiHidden="1" w:uiPriority="39" w:unhideWhenUsed="1"/>
+    <w:lsdException w:name="toc 2" w:semiHidden="1" w:uiPriority="39" w:unhideWhenUsed="1"/>
+    <w:lsdException w:name="toc 3" w:semiHidden="1" w:uiPriority="39" w:unhideWhenUsed="1"/>
+    <w:lsdException w:name="toc 4" w:semiHidden="1" w:uiPriority="39" w:unhideWhenUsed="1"/>
+    <w:lsdException w:name="toc 5" w:semiHidden="1" w:uiPriority="39" w:unhideWhenUsed="1"/>
+    <w:lsdException w:name="toc 6" w:semiHidden="1" w:uiPriority="39" w:unhideWhenUsed="1"/>
+    <w:lsdException w:name="toc 7" w:semiHidden="1" w:uiPriority="39" w:unhideWhenUsed="1"/>
+    <w:lsdException w:name="toc 8" w:semiHidden="1" w:uiPriority="39" w:unhideWhenUsed="1"/>
+    <w:lsdException w:name="toc 9" w:semiHidden="1" w:uiPriority="39" w:unhideWhenUsed="1"/>
     <w:lsdException w:name="Normal Indent" w:semiHidden="1" w:unhideWhenUsed="1"/>
     <w:lsdException w:name="footnote text" w:semiHidden="1" w:unhideWhenUsed="1"/>
     <w:lsdException w:name="annotation text" w:semiHidden="1" w:unhideWhenUsed="1"/>
     <w:lsdException w:name="header" w:semiHidden="1" w:unhideWhenUsed="1"/>
     <w:lsdException w:name="footer" w:semiHidden="1" w:unhideWhenUsed="1"/>
     <w:lsdException w:name="index heading" w:semiHidden="1" w:unhideWhenUsed="1"/>
-    <w:lsdException w:name="caption" w:uiPriority="35" w:semiHidden="1" w:unhideWhenUsed="1" w:qFormat="1"/>
+    <w:lsdException w:name="caption" w:semiHidden="1" w:uiPriority="35" w:unhideWhenUsed="1" w:qFormat="1"/>
     <w:lsdException w:name="table of figures" w:semiHidden="1" w:unhideWhenUsed="1"/>
     <w:lsdException w:name="envelope address" w:semiHidden="1" w:unhideWhenUsed="1"/>
     <w:lsdException w:name="envelope return" w:semiHidden="1" w:unhideWhenUsed="1"/>
@@ -368,7 +324,7 @@
     <w:lsdException w:name="Title" w:uiPriority="10" w:qFormat="1"/>
     <w:lsdException w:name="Closing" w:semiHidden="1" w:unhideWhenUsed="1"/>
     <w:lsdException w:name="Signature" w:semiHidden="1" w:unhideWhenUsed="1"/>
-    <w:lsdException w:name="Default Paragraph Font" w:uiPriority="1" w:semiHidden="1" w:unhideWhenUsed="1"/>
+    <w:lsdException w:name="Default Paragraph Font" w:semiHidden="1" w:uiPriority="1" w:unhideWhenUsed="1"/>
     <w:lsdException w:name="Body Text" w:semiHidden="1" w:unhideWhenUsed="1"/>
     <w:lsdException w:name="Body Text Indent" w:semiHidden="1" w:unhideWhenUsed="1"/>
     <w:lsdException w:name="List Continue" w:semiHidden="1" w:unhideWhenUsed="1"/>
@@ -568,8 +524,8 @@
     <w:lsdException w:name="Subtle Reference" w:uiPriority="31" w:qFormat="1"/>
     <w:lsdException w:name="Intense Reference" w:uiPriority="32" w:qFormat="1"/>
     <w:lsdException w:name="Book Title" w:uiPriority="33" w:qFormat="1"/>
-    <w:lsdException w:name="Bibliography" w:uiPriority="37" w:semiHidden="1" w:unhideWhenUsed="1"/>
-    <w:lsdException w:name="TOC Heading" w:uiPriority="39" w:semiHidden="1" w:unhideWhenUsed="1" w:qFormat="1"/>
+    <w:lsdException w:name="Bibliography" w:semiHidden="1" w:uiPriority="37" w:unhideWhenUsed="1"/>
+    <w:lsdException w:name="TOC Heading" w:semiHidden="1" w:uiPriority="39" w:unhideWhenUsed="1" w:qFormat="1"/>
     <w:lsdException w:name="Plain Table 1" w:uiPriority="41"/>
     <w:lsdException w:name="Plain Table 2" w:uiPriority="42"/>
     <w:lsdException w:name="Plain Table 3" w:uiPriority="43"/>
@@ -680,7 +636,7 @@
     <w:lsdException w:name="Unresolved Mention" w:semiHidden="1" w:unhideWhenUsed="1"/>
     <w:lsdException w:name="Smart Link" w:semiHidden="1" w:unhideWhenUsed="1"/>
   </w:latentStyles>
-  <w:style w:type="paragraph" w:styleId="Normal" w:default="1">
+  <w:style w:type="paragraph" w:default="1" w:styleId="Normal">
     <w:name w:val="Normal"/>
     <w:qFormat/>
     <w:rsid w:val="00534C3F"/>
@@ -700,7 +656,7 @@
       <w:outlineLvl w:val="0"/>
     </w:pPr>
     <w:rPr>
-      <w:rFonts w:asciiTheme="majorHAnsi" w:hAnsiTheme="majorHAnsi" w:eastAsiaTheme="majorEastAsia" w:cstheme="majorBidi"/>
+      <w:rFonts w:asciiTheme="majorHAnsi" w:eastAsiaTheme="majorEastAsia" w:hAnsiTheme="majorHAnsi" w:cstheme="majorBidi"/>
       <w:color w:val="0F4761" w:themeColor="accent1" w:themeShade="BF"/>
       <w:sz w:val="40"/>
       <w:szCs w:val="40"/>
@@ -723,7 +679,7 @@
       <w:outlineLvl w:val="1"/>
     </w:pPr>
     <w:rPr>
-      <w:rFonts w:asciiTheme="majorHAnsi" w:hAnsiTheme="majorHAnsi" w:eastAsiaTheme="majorEastAsia" w:cstheme="majorBidi"/>
+      <w:rFonts w:asciiTheme="majorHAnsi" w:eastAsiaTheme="majorEastAsia" w:hAnsiTheme="majorHAnsi" w:cstheme="majorBidi"/>
       <w:color w:val="0F4761" w:themeColor="accent1" w:themeShade="BF"/>
       <w:sz w:val="32"/>
       <w:szCs w:val="32"/>
@@ -884,12 +840,13 @@
       <w:color w:val="272727" w:themeColor="text1" w:themeTint="D8"/>
     </w:rPr>
   </w:style>
-  <w:style w:type="character" w:styleId="DefaultParagraphFont" w:default="1">
+  <w:style w:type="character" w:default="1" w:styleId="DefaultParagraphFont">
     <w:name w:val="Default Paragraph Font"/>
     <w:uiPriority w:val="1"/>
+    <w:semiHidden/>
     <w:unhideWhenUsed/>
   </w:style>
-  <w:style w:type="table" w:styleId="TableNormal" w:default="1">
+  <w:style w:type="table" w:default="1" w:styleId="TableNormal">
     <w:name w:val="Normal Table"/>
     <w:uiPriority w:val="99"/>
     <w:semiHidden/>
@@ -904,26 +861,26 @@
       </w:tblCellMar>
     </w:tblPr>
   </w:style>
-  <w:style w:type="numbering" w:styleId="NoList" w:default="1">
+  <w:style w:type="numbering" w:default="1" w:styleId="NoList">
     <w:name w:val="No List"/>
     <w:uiPriority w:val="99"/>
     <w:semiHidden/>
     <w:unhideWhenUsed/>
   </w:style>
-  <w:style w:type="character" w:styleId="Heading1Char" w:customStyle="1">
+  <w:style w:type="character" w:customStyle="1" w:styleId="Heading1Char">
     <w:name w:val="Heading 1 Char"/>
     <w:basedOn w:val="DefaultParagraphFont"/>
     <w:link w:val="Heading1"/>
     <w:uiPriority w:val="9"/>
     <w:rsid w:val="004C43E3"/>
     <w:rPr>
-      <w:rFonts w:asciiTheme="majorHAnsi" w:hAnsiTheme="majorHAnsi" w:eastAsiaTheme="majorEastAsia" w:cstheme="majorBidi"/>
+      <w:rFonts w:asciiTheme="majorHAnsi" w:eastAsiaTheme="majorEastAsia" w:hAnsiTheme="majorHAnsi" w:cstheme="majorBidi"/>
       <w:color w:val="0F4761" w:themeColor="accent1" w:themeShade="BF"/>
       <w:sz w:val="40"/>
       <w:szCs w:val="40"/>
     </w:rPr>
   </w:style>
-  <w:style w:type="character" w:styleId="Heading2Char" w:customStyle="1">
+  <w:style w:type="character" w:customStyle="1" w:styleId="Heading2Char">
     <w:name w:val="Heading 2 Char"/>
     <w:basedOn w:val="DefaultParagraphFont"/>
     <w:link w:val="Heading2"/>
@@ -931,13 +888,13 @@
     <w:semiHidden/>
     <w:rsid w:val="004C43E3"/>
     <w:rPr>
-      <w:rFonts w:asciiTheme="majorHAnsi" w:hAnsiTheme="majorHAnsi" w:eastAsiaTheme="majorEastAsia" w:cstheme="majorBidi"/>
+      <w:rFonts w:asciiTheme="majorHAnsi" w:eastAsiaTheme="majorEastAsia" w:hAnsiTheme="majorHAnsi" w:cstheme="majorBidi"/>
       <w:color w:val="0F4761" w:themeColor="accent1" w:themeShade="BF"/>
       <w:sz w:val="32"/>
       <w:szCs w:val="32"/>
     </w:rPr>
   </w:style>
-  <w:style w:type="character" w:styleId="Heading3Char" w:customStyle="1">
+  <w:style w:type="character" w:customStyle="1" w:styleId="Heading3Char">
     <w:name w:val="Heading 3 Char"/>
     <w:basedOn w:val="DefaultParagraphFont"/>
     <w:link w:val="Heading3"/>
@@ -951,7 +908,7 @@
       <w:szCs w:val="28"/>
     </w:rPr>
   </w:style>
-  <w:style w:type="character" w:styleId="Heading4Char" w:customStyle="1">
+  <w:style w:type="character" w:customStyle="1" w:styleId="Heading4Char">
     <w:name w:val="Heading 4 Char"/>
     <w:basedOn w:val="DefaultParagraphFont"/>
     <w:link w:val="Heading4"/>
@@ -965,7 +922,7 @@
       <w:color w:val="0F4761" w:themeColor="accent1" w:themeShade="BF"/>
     </w:rPr>
   </w:style>
-  <w:style w:type="character" w:styleId="Heading5Char" w:customStyle="1">
+  <w:style w:type="character" w:customStyle="1" w:styleId="Heading5Char">
     <w:name w:val="Heading 5 Char"/>
     <w:basedOn w:val="DefaultParagraphFont"/>
     <w:link w:val="Heading5"/>
@@ -977,7 +934,7 @@
       <w:color w:val="0F4761" w:themeColor="accent1" w:themeShade="BF"/>
     </w:rPr>
   </w:style>
-  <w:style w:type="character" w:styleId="Heading6Char" w:customStyle="1">
+  <w:style w:type="character" w:customStyle="1" w:styleId="Heading6Char">
     <w:name w:val="Heading 6 Char"/>
     <w:basedOn w:val="DefaultParagraphFont"/>
     <w:link w:val="Heading6"/>
@@ -991,7 +948,7 @@
       <w:color w:val="595959" w:themeColor="text1" w:themeTint="A6"/>
     </w:rPr>
   </w:style>
-  <w:style w:type="character" w:styleId="Heading7Char" w:customStyle="1">
+  <w:style w:type="character" w:customStyle="1" w:styleId="Heading7Char">
     <w:name w:val="Heading 7 Char"/>
     <w:basedOn w:val="DefaultParagraphFont"/>
     <w:link w:val="Heading7"/>
@@ -1003,7 +960,7 @@
       <w:color w:val="595959" w:themeColor="text1" w:themeTint="A6"/>
     </w:rPr>
   </w:style>
-  <w:style w:type="character" w:styleId="Heading8Char" w:customStyle="1">
+  <w:style w:type="character" w:customStyle="1" w:styleId="Heading8Char">
     <w:name w:val="Heading 8 Char"/>
     <w:basedOn w:val="DefaultParagraphFont"/>
     <w:link w:val="Heading8"/>
@@ -1017,7 +974,7 @@
       <w:color w:val="272727" w:themeColor="text1" w:themeTint="D8"/>
     </w:rPr>
   </w:style>
-  <w:style w:type="character" w:styleId="Heading9Char" w:customStyle="1">
+  <w:style w:type="character" w:customStyle="1" w:styleId="Heading9Char">
     <w:name w:val="Heading 9 Char"/>
     <w:basedOn w:val="DefaultParagraphFont"/>
     <w:link w:val="Heading9"/>
@@ -1042,21 +999,21 @@
       <w:contextualSpacing/>
     </w:pPr>
     <w:rPr>
-      <w:rFonts w:asciiTheme="majorHAnsi" w:hAnsiTheme="majorHAnsi" w:eastAsiaTheme="majorEastAsia" w:cstheme="majorBidi"/>
+      <w:rFonts w:asciiTheme="majorHAnsi" w:eastAsiaTheme="majorEastAsia" w:hAnsiTheme="majorHAnsi" w:cstheme="majorBidi"/>
       <w:spacing w:val="-10"/>
       <w:kern w:val="28"/>
       <w:sz w:val="56"/>
       <w:szCs w:val="56"/>
     </w:rPr>
   </w:style>
-  <w:style w:type="character" w:styleId="TitleChar" w:customStyle="1">
+  <w:style w:type="character" w:customStyle="1" w:styleId="TitleChar">
     <w:name w:val="Title Char"/>
     <w:basedOn w:val="DefaultParagraphFont"/>
     <w:link w:val="Title"/>
     <w:uiPriority w:val="10"/>
     <w:rsid w:val="004C43E3"/>
     <w:rPr>
-      <w:rFonts w:asciiTheme="majorHAnsi" w:hAnsiTheme="majorHAnsi" w:eastAsiaTheme="majorEastAsia" w:cstheme="majorBidi"/>
+      <w:rFonts w:asciiTheme="majorHAnsi" w:eastAsiaTheme="majorEastAsia" w:hAnsiTheme="majorHAnsi" w:cstheme="majorBidi"/>
       <w:spacing w:val="-10"/>
       <w:kern w:val="28"/>
       <w:sz w:val="56"/>
@@ -1084,7 +1041,7 @@
       <w:szCs w:val="28"/>
     </w:rPr>
   </w:style>
-  <w:style w:type="character" w:styleId="SubtitleChar" w:customStyle="1">
+  <w:style w:type="character" w:customStyle="1" w:styleId="SubtitleChar">
     <w:name w:val="Subtitle Char"/>
     <w:basedOn w:val="DefaultParagraphFont"/>
     <w:link w:val="Subtitle"/>
@@ -1116,7 +1073,7 @@
       <w:color w:val="404040" w:themeColor="text1" w:themeTint="BF"/>
     </w:rPr>
   </w:style>
-  <w:style w:type="character" w:styleId="QuoteChar" w:customStyle="1">
+  <w:style w:type="character" w:customStyle="1" w:styleId="QuoteChar">
     <w:name w:val="Quote Char"/>
     <w:basedOn w:val="DefaultParagraphFont"/>
     <w:link w:val="Quote"/>
@@ -1161,8 +1118,8 @@
     <w:rsid w:val="004C43E3"/>
     <w:pPr>
       <w:pBdr>
-        <w:top w:val="single" w:color="0F4761" w:themeColor="accent1" w:themeShade="BF" w:sz="4" w:space="10"/>
-        <w:bottom w:val="single" w:color="0F4761" w:themeColor="accent1" w:themeShade="BF" w:sz="4" w:space="10"/>
+        <w:top w:val="single" w:sz="4" w:space="10" w:color="0F4761" w:themeColor="accent1" w:themeShade="BF"/>
+        <w:bottom w:val="single" w:sz="4" w:space="10" w:color="0F4761" w:themeColor="accent1" w:themeShade="BF"/>
       </w:pBdr>
       <w:spacing w:before="360" w:after="360"/>
       <w:ind w:left="864" w:right="864"/>
@@ -1174,7 +1131,7 @@
       <w:color w:val="0F4761" w:themeColor="accent1" w:themeShade="BF"/>
     </w:rPr>
   </w:style>
-  <w:style w:type="character" w:styleId="IntenseQuoteChar" w:customStyle="1">
+  <w:style w:type="character" w:customStyle="1" w:styleId="IntenseQuoteChar">
     <w:name w:val="Intense Quote Char"/>
     <w:basedOn w:val="DefaultParagraphFont"/>
     <w:link w:val="IntenseQuote"/>
@@ -1215,7 +1172,7 @@
       <w:spacing w:after="0" w:line="240" w:lineRule="auto"/>
     </w:pPr>
   </w:style>
-  <w:style w:type="character" w:styleId="HeaderChar" w:customStyle="1">
+  <w:style w:type="character" w:customStyle="1" w:styleId="HeaderChar">
     <w:name w:val="Header Char"/>
     <w:basedOn w:val="DefaultParagraphFont"/>
     <w:link w:val="Header"/>
@@ -1237,7 +1194,7 @@
       <w:spacing w:after="0" w:line="240" w:lineRule="auto"/>
     </w:pPr>
   </w:style>
-  <w:style w:type="character" w:styleId="FooterChar" w:customStyle="1">
+  <w:style w:type="character" w:customStyle="1" w:styleId="FooterChar">
     <w:name w:val="Footer Char"/>
     <w:basedOn w:val="DefaultParagraphFont"/>
     <w:link w:val="Footer"/>
@@ -1271,7 +1228,7 @@
 </file>
 
 <file path=word/theme/theme1.xml><?xml version="1.0" encoding="utf-8"?>
-<a:theme xmlns:a="http://schemas.openxmlformats.org/drawingml/2006/main" xmlns:thm15="http://schemas.microsoft.com/office/thememl/2012/main" name="Office Theme">
+<a:theme xmlns:a="http://schemas.openxmlformats.org/drawingml/2006/main" name="Office Theme">
   <a:themeElements>
     <a:clrScheme name="Office">
       <a:dk1>

</xml_diff>